<commit_message>
Correct final training report dates
</commit_message>
<xml_diff>
--- a/docs/internship-reports/Engineering Training Technical Report.docx
+++ b/docs/internship-reports/Engineering Training Technical Report.docx
@@ -20,7 +20,7 @@
           <w:szCs w:val="28"/>
         </w:rPr>
         <w:drawing>
-          <wp:anchor distT="0" distB="0" distL="114300" distR="114300" simplePos="0" relativeHeight="251657728" behindDoc="0" locked="0" layoutInCell="1" allowOverlap="1" wp14:anchorId="5E77C3A3" wp14:editId="33993D4D">
+          <wp:anchor distT="0" distB="0" distL="114300" distR="114300" simplePos="0" relativeHeight="251657728" behindDoc="0" locked="0" layoutInCell="1" allowOverlap="1" wp14:anchorId="0263B429" wp14:editId="46033939">
             <wp:simplePos x="0" y="0"/>
             <wp:positionH relativeFrom="column">
               <wp:align>center</wp:align>
@@ -334,7 +334,7 @@
           <w:color w:val="000000"/>
           <w:sz w:val="28"/>
         </w:rPr>
-        <w:t>19 July 2026 to 14 September 2026</w:t>
+        <w:t>19 July 2026 to 11 September 2026</w:t>
       </w:r>
     </w:p>
     <w:p>
@@ -413,7 +413,7 @@
       <w:r>
         <w:fldChar w:fldCharType="separate"/>
       </w:r>
-      <w:hyperlink w:anchor="_Toc240254546" w:history="1">
+      <w:hyperlink w:anchor="_Toc240287870" w:history="1">
         <w:r>
           <w:rPr>
             <w:rStyle w:val="Hyperlink"/>
@@ -441,7 +441,7 @@
             <w:noProof/>
             <w:webHidden/>
           </w:rPr>
-          <w:instrText xml:space="preserve"> PAGEREF _Toc240254546 \h </w:instrText>
+          <w:instrText xml:space="preserve"> PAGEREF _Toc240287870 \h </w:instrText>
         </w:r>
         <w:r>
           <w:rPr>
@@ -483,7 +483,7 @@
           <w14:ligatures w14:val="standardContextual"/>
         </w:rPr>
       </w:pPr>
-      <w:hyperlink w:anchor="_Toc240254547" w:history="1">
+      <w:hyperlink w:anchor="_Toc240287871" w:history="1">
         <w:r>
           <w:rPr>
             <w:rStyle w:val="Hyperlink"/>
@@ -511,7 +511,7 @@
             <w:noProof/>
             <w:webHidden/>
           </w:rPr>
-          <w:instrText xml:space="preserve"> PAGEREF _Toc240254547 \h </w:instrText>
+          <w:instrText xml:space="preserve"> PAGEREF _Toc240287871 \h </w:instrText>
         </w:r>
         <w:r>
           <w:rPr>
@@ -553,7 +553,7 @@
           <w14:ligatures w14:val="standardContextual"/>
         </w:rPr>
       </w:pPr>
-      <w:hyperlink w:anchor="_Toc240254548" w:history="1">
+      <w:hyperlink w:anchor="_Toc240287872" w:history="1">
         <w:r>
           <w:rPr>
             <w:rStyle w:val="Hyperlink"/>
@@ -581,7 +581,7 @@
             <w:noProof/>
             <w:webHidden/>
           </w:rPr>
-          <w:instrText xml:space="preserve"> PAGEREF _Toc240254548 \h </w:instrText>
+          <w:instrText xml:space="preserve"> PAGEREF _Toc240287872 \h </w:instrText>
         </w:r>
         <w:r>
           <w:rPr>
@@ -623,7 +623,7 @@
           <w14:ligatures w14:val="standardContextual"/>
         </w:rPr>
       </w:pPr>
-      <w:hyperlink w:anchor="_Toc240254549" w:history="1">
+      <w:hyperlink w:anchor="_Toc240287873" w:history="1">
         <w:r>
           <w:rPr>
             <w:rStyle w:val="Hyperlink"/>
@@ -651,7 +651,7 @@
             <w:noProof/>
             <w:webHidden/>
           </w:rPr>
-          <w:instrText xml:space="preserve"> PAGEREF _Toc240254549 \h </w:instrText>
+          <w:instrText xml:space="preserve"> PAGEREF _Toc240287873 \h </w:instrText>
         </w:r>
         <w:r>
           <w:rPr>
@@ -693,7 +693,7 @@
           <w14:ligatures w14:val="standardContextual"/>
         </w:rPr>
       </w:pPr>
-      <w:hyperlink w:anchor="_Toc240254550" w:history="1">
+      <w:hyperlink w:anchor="_Toc240287874" w:history="1">
         <w:r>
           <w:rPr>
             <w:rStyle w:val="Hyperlink"/>
@@ -721,7 +721,7 @@
             <w:noProof/>
             <w:webHidden/>
           </w:rPr>
-          <w:instrText xml:space="preserve"> PAGEREF _Toc240254550 \h </w:instrText>
+          <w:instrText xml:space="preserve"> PAGEREF _Toc240287874 \h </w:instrText>
         </w:r>
         <w:r>
           <w:rPr>
@@ -763,7 +763,7 @@
           <w14:ligatures w14:val="standardContextual"/>
         </w:rPr>
       </w:pPr>
-      <w:hyperlink w:anchor="_Toc240254551" w:history="1">
+      <w:hyperlink w:anchor="_Toc240287875" w:history="1">
         <w:r>
           <w:rPr>
             <w:rStyle w:val="Hyperlink"/>
@@ -791,7 +791,7 @@
             <w:noProof/>
             <w:webHidden/>
           </w:rPr>
-          <w:instrText xml:space="preserve"> PAGEREF _Toc240254551 \h </w:instrText>
+          <w:instrText xml:space="preserve"> PAGEREF _Toc240287875 \h </w:instrText>
         </w:r>
         <w:r>
           <w:rPr>
@@ -838,7 +838,7 @@
         <w:spacing w:before="200" w:after="160"/>
         <w:jc w:val="center"/>
       </w:pPr>
-      <w:bookmarkStart w:id="0" w:name="_Toc240254546"/>
+      <w:bookmarkStart w:id="0" w:name="_Toc240287870"/>
       <w:r>
         <w:lastRenderedPageBreak/>
         <w:t>Training Summary</w:t>
@@ -854,7 +854,7 @@
         <w:rPr>
           <w:color w:val="000000"/>
         </w:rPr>
-        <w:t xml:space="preserve">This report summarizes the eight-week engineering training completed at PayOne from 19 July to 14 September 2026. The placement was in Software Development within an institution whose field is payment systems and payment gateways. The practical project was a Java web application for secure user and role administration. It began as a Servlet/JSP application and was progressively extended into a layered system with database persistence, authentication, authorization, password controls, audit logging, account </w:t>
+        <w:t xml:space="preserve">This report summarizes the eight-week engineering training completed at PayOne from 19 July to 11 September 2026. The placement was in Software Development within an institution whose field is payment systems and payment gateways. The practical project was a Java web application for secure user and role administration. It began as a Servlet/JSP application and was progressively extended into a layered system with database persistence, authentication, authorization, password controls, audit logging, account </w:t>
       </w:r>
       <w:r>
         <w:rPr>
@@ -925,7 +925,7 @@
         <w:spacing w:before="200" w:after="160"/>
         <w:jc w:val="center"/>
       </w:pPr>
-      <w:bookmarkStart w:id="1" w:name="_Toc240254547"/>
+      <w:bookmarkStart w:id="1" w:name="_Toc240287871"/>
       <w:r>
         <w:lastRenderedPageBreak/>
         <w:t>Chapter 1: Institution Profile and Training Outline</w:t>
@@ -1624,7 +1624,7 @@
         <w:spacing w:before="200" w:after="160"/>
         <w:jc w:val="center"/>
       </w:pPr>
-      <w:bookmarkStart w:id="2" w:name="_Toc240254548"/>
+      <w:bookmarkStart w:id="2" w:name="_Toc240287872"/>
       <w:r>
         <w:lastRenderedPageBreak/>
         <w:t>Chapter 2: Practical Training</w:t>
@@ -3276,7 +3276,7 @@
         <w:spacing w:before="200" w:after="160"/>
         <w:jc w:val="center"/>
       </w:pPr>
-      <w:bookmarkStart w:id="3" w:name="_Toc240254549"/>
+      <w:bookmarkStart w:id="3" w:name="_Toc240287873"/>
       <w:r>
         <w:lastRenderedPageBreak/>
         <w:t>Chapter 3: Impact of Training</w:t>
@@ -3428,7 +3428,7 @@
         <w:spacing w:before="200" w:after="160"/>
         <w:jc w:val="center"/>
       </w:pPr>
-      <w:bookmarkStart w:id="4" w:name="_Toc240254550"/>
+      <w:bookmarkStart w:id="4" w:name="_Toc240287874"/>
       <w:r>
         <w:lastRenderedPageBreak/>
         <w:t>Chapter 4: Conclusions</w:t>
@@ -3491,7 +3491,7 @@
         <w:spacing w:before="200" w:after="160"/>
         <w:jc w:val="center"/>
       </w:pPr>
-      <w:bookmarkStart w:id="5" w:name="_Toc240254551"/>
+      <w:bookmarkStart w:id="5" w:name="_Toc240287875"/>
       <w:r>
         <w:lastRenderedPageBreak/>
         <w:t>Chapter 5: Recommendations</w:t>

</xml_diff>